<commit_message>
Fix blockquote formatting in Word export
Co-Authored-By: Claude Opus 5 <noreply@anthropic.com>
Claude-Session: https://claude.ai/code/session_01SKQNiN3t1JyD8NZXguXbrf
</commit_message>
<xml_diff>
--- a/docs/Yaadhum Marks Engine — Pilot Design.docx
+++ b/docs/Yaadhum Marks Engine — Pilot Design.docx
@@ -105,7 +105,42 @@
         <w:pStyle w:val="IntenseQuote"/>
       </w:pPr>
       <w:r>
-        <w:t>**The paid multimodal model is the pilot. The open-source model is the destination.</w:t>
+        <w:rPr>
+          <w:b/>
+        </w:rPr>
+        <w:t>The paid multimodal model is the pilot. The open-source model is the destination. The data-capture layer is the bridge between them, and it must be built on day one.</w:t>
+      </w:r>
+    </w:p>
+    <w:p>
+      <w:r>
+        <w:t xml:space="preserve">Starting with open-source models means labelling several hundred crops by hand </w:t>
+      </w:r>
+      <w:r>
+        <w:rPr>
+          <w:i/>
+        </w:rPr>
+        <w:t>before you can ship anything</w:t>
+      </w:r>
+      <w:r>
+        <w:t>. Starting with the paid model means you ship in two weeks, and every page it processes generates exactly the labelled data you need to train the free one. Within one term of normal use you will have enough data to train the open recogniser, at which point you swap one component and your marginal cost goes to zero.</w:t>
+      </w:r>
+    </w:p>
+    <w:p>
+      <w:r>
+        <w:t>That is why Section 5 — the training data store — is the most important section in this document, even though it is not the most interesting one.</w:t>
+      </w:r>
+    </w:p>
+    <w:p>
+      <w:pPr>
+        <w:pStyle w:val="Heading2"/>
+      </w:pPr>
+      <w:r>
+        <w:t>2. Layer segregation: seven layers, one replaceable</w:t>
+      </w:r>
+    </w:p>
+    <w:p>
+      <w:r>
+        <w:t>You asked how the layers are separated. The organising principle is this:</w:t>
       </w:r>
     </w:p>
     <w:p>
@@ -113,55 +148,10 @@
         <w:pStyle w:val="IntenseQuote"/>
       </w:pPr>
       <w:r>
-        <w:t>The data-capture layer is the bridge between them, and it must be built on day one.**</w:t>
-      </w:r>
-    </w:p>
-    <w:p>
-      <w:r>
-        <w:t xml:space="preserve">Starting with open-source models means labelling several hundred crops by hand </w:t>
-      </w:r>
-      <w:r>
         <w:rPr>
-          <w:i/>
+          <w:b/>
         </w:rPr>
-        <w:t>before you can ship anything</w:t>
-      </w:r>
-      <w:r>
-        <w:t>. Starting with the paid model means you ship in two weeks, and every page it processes generates exactly the labelled data you need to train the free one. Within one term of normal use you will have enough data to train the open recogniser, at which point you swap one component and your marginal cost goes to zero.</w:t>
-      </w:r>
-    </w:p>
-    <w:p>
-      <w:r>
-        <w:t>That is why Section 5 — the training data store — is the most important section in this document, even though it is not the most interesting one.</w:t>
-      </w:r>
-    </w:p>
-    <w:p>
-      <w:pPr>
-        <w:pStyle w:val="Heading2"/>
-      </w:pPr>
-      <w:r>
-        <w:t>2. Layer segregation: seven layers, one replaceable</w:t>
-      </w:r>
-    </w:p>
-    <w:p>
-      <w:r>
-        <w:t>You asked how the layers are separated. The organising principle is this:</w:t>
-      </w:r>
-    </w:p>
-    <w:p>
-      <w:pPr>
-        <w:pStyle w:val="IntenseQuote"/>
-      </w:pPr>
-      <w:r>
-        <w:t>**Exactly one layer contains a model. Every other layer is deterministic code that cannot</w:t>
-      </w:r>
-    </w:p>
-    <w:p>
-      <w:pPr>
-        <w:pStyle w:val="IntenseQuote"/>
-      </w:pPr>
-      <w:r>
-        <w:t>hallucinate, cannot drift, and cannot be wrong in a way you did not write yourself.**</w:t>
+        <w:t>Exactly one layer contains a model. Every other layer is deterministic code that cannot hallucinate, cannot drift, and cannot be wrong in a way you did not write yourself.</w:t>
       </w:r>
     </w:p>
     <w:p>
@@ -1800,31 +1790,7 @@
         <w:t>Closed-vocabulary filter.</w:t>
       </w:r>
       <w:r>
-        <w:t xml:space="preserve"> A candidate is accepted as an anchor only if the parsed label exists</w:t>
-      </w:r>
-    </w:p>
-    <w:p>
-      <w:pPr>
-        <w:pStyle w:val="IntenseQuote"/>
-      </w:pPr>
-      <w:r>
-        <w:t>in the frozen Q-matrix for this paper. A hallucinated "Q47" on a thirty-question paper is</w:t>
-      </w:r>
-    </w:p>
-    <w:p>
-      <w:pPr>
-        <w:pStyle w:val="IntenseQuote"/>
-      </w:pPr>
-      <w:r>
-        <w:t>discarded automatically, by construction. This is the anti-hallucination control at the</w:t>
-      </w:r>
-    </w:p>
-    <w:p>
-      <w:pPr>
-        <w:pStyle w:val="IntenseQuote"/>
-      </w:pPr>
-      <w:r>
-        <w:t>localisation layer, and it costs nothing.</w:t>
+        <w:t xml:space="preserve"> A candidate is accepted as an anchor only if the parsed label exists in the frozen Q-matrix for this paper. A hallucinated "Q47" on a thirty-question paper is discarded automatically, by construction. This is the anti-hallucination control at the localisation layer, and it costs nothing.</w:t>
       </w:r>
     </w:p>
     <w:p>

</xml_diff>